<commit_message>
Fix to formatting on assessment doc
</commit_message>
<xml_diff>
--- a/CodesphereAssessment.docx
+++ b/CodesphereAssessment.docx
@@ -84,33 +84,14 @@
           <w:b/>
           <w:bCs/>
         </w:rPr>
-      </w:r>
-    </w:p>
-    <w:p>
-      <w:pPr>
-        <w:pStyle w:val="BodyText"/>
-        <w:bidi w:val="0"/>
-        <w:jc w:val="start"/>
-        <w:rPr>
-          <w:rFonts w:ascii="Garamond" w:hAnsi="Garamond"/>
-          <w:b/>
-          <w:bCs/>
-        </w:rPr>
-      </w:pPr>
-      <w:r>
-        <w:rPr>
-          <w:rFonts w:ascii="Garamond" w:hAnsi="Garamond"/>
-          <w:b/>
-          <w:bCs/>
-        </w:rPr>
         <w:drawing>
           <wp:anchor behindDoc="0" distT="0" distB="0" distL="0" distR="0" simplePos="0" locked="0" layoutInCell="0" allowOverlap="1" relativeHeight="2">
             <wp:simplePos x="0" y="0"/>
             <wp:positionH relativeFrom="column">
-              <wp:align>center</wp:align>
+              <wp:posOffset>469265</wp:posOffset>
             </wp:positionH>
             <wp:positionV relativeFrom="paragraph">
-              <wp:posOffset>635</wp:posOffset>
+              <wp:posOffset>-52705</wp:posOffset>
             </wp:positionV>
             <wp:extent cx="5181600" cy="3302000"/>
             <wp:effectExtent l="0" t="0" r="0" b="0"/>
@@ -158,33 +139,226 @@
         <w:jc w:val="start"/>
         <w:rPr>
           <w:rFonts w:ascii="Garamond" w:hAnsi="Garamond"/>
-          <w:b w:val="false"/>
-          <w:bCs w:val="false"/>
-        </w:rPr>
-      </w:pPr>
-      <w:r>
-        <w:rPr>
-          <w:rFonts w:ascii="Garamond" w:hAnsi="Garamond"/>
-          <w:b w:val="false"/>
-          <w:bCs w:val="false"/>
-        </w:rPr>
-        <w:t xml:space="preserve">I chose a graph structure because road networks naturally form graphs where intersections represent nodes and roads represent edges. The </w:t>
-      </w:r>
-      <w:r>
-        <w:rPr>
-          <w:rFonts w:ascii="Garamond" w:hAnsi="Garamond"/>
-          <w:b w:val="false"/>
-          <w:bCs w:val="false"/>
-        </w:rPr>
-        <w:t>common</w:t>
-      </w:r>
-      <w:r>
-        <w:rPr>
-          <w:rFonts w:ascii="Garamond" w:hAnsi="Garamond"/>
-          <w:b w:val="false"/>
-          <w:bCs w:val="false"/>
-        </w:rPr>
-        <w:t xml:space="preserve"> structure allows efficient traversal and route discovery between connected intersections. </w:t>
+          <w:b/>
+          <w:bCs/>
+        </w:rPr>
+      </w:pPr>
+      <w:r>
+        <w:rPr>
+          <w:rFonts w:ascii="Garamond" w:hAnsi="Garamond"/>
+          <w:b/>
+          <w:bCs/>
+        </w:rPr>
+      </w:r>
+    </w:p>
+    <w:p>
+      <w:pPr>
+        <w:pStyle w:val="BodyText"/>
+        <w:bidi w:val="0"/>
+        <w:jc w:val="start"/>
+        <w:rPr>
+          <w:rFonts w:ascii="Garamond" w:hAnsi="Garamond"/>
+          <w:b w:val="false"/>
+          <w:bCs w:val="false"/>
+        </w:rPr>
+      </w:pPr>
+      <w:r>
+        <w:rPr>
+          <w:rFonts w:ascii="Garamond" w:hAnsi="Garamond"/>
+          <w:b w:val="false"/>
+          <w:bCs w:val="false"/>
+        </w:rPr>
+      </w:r>
+    </w:p>
+    <w:p>
+      <w:pPr>
+        <w:pStyle w:val="BodyText"/>
+        <w:bidi w:val="0"/>
+        <w:jc w:val="start"/>
+        <w:rPr>
+          <w:rFonts w:ascii="Garamond" w:hAnsi="Garamond"/>
+          <w:b w:val="false"/>
+          <w:bCs w:val="false"/>
+        </w:rPr>
+      </w:pPr>
+      <w:r>
+        <w:rPr>
+          <w:rFonts w:ascii="Garamond" w:hAnsi="Garamond"/>
+          <w:b w:val="false"/>
+          <w:bCs w:val="false"/>
+        </w:rPr>
+      </w:r>
+    </w:p>
+    <w:p>
+      <w:pPr>
+        <w:pStyle w:val="BodyText"/>
+        <w:bidi w:val="0"/>
+        <w:jc w:val="start"/>
+        <w:rPr>
+          <w:rFonts w:ascii="Garamond" w:hAnsi="Garamond"/>
+          <w:b w:val="false"/>
+          <w:bCs w:val="false"/>
+        </w:rPr>
+      </w:pPr>
+      <w:r>
+        <w:rPr>
+          <w:rFonts w:ascii="Garamond" w:hAnsi="Garamond"/>
+          <w:b w:val="false"/>
+          <w:bCs w:val="false"/>
+        </w:rPr>
+      </w:r>
+    </w:p>
+    <w:p>
+      <w:pPr>
+        <w:pStyle w:val="BodyText"/>
+        <w:bidi w:val="0"/>
+        <w:jc w:val="start"/>
+        <w:rPr>
+          <w:rFonts w:ascii="Garamond" w:hAnsi="Garamond"/>
+          <w:b w:val="false"/>
+          <w:bCs w:val="false"/>
+        </w:rPr>
+      </w:pPr>
+      <w:r>
+        <w:rPr>
+          <w:rFonts w:ascii="Garamond" w:hAnsi="Garamond"/>
+          <w:b w:val="false"/>
+          <w:bCs w:val="false"/>
+        </w:rPr>
+      </w:r>
+    </w:p>
+    <w:p>
+      <w:pPr>
+        <w:pStyle w:val="BodyText"/>
+        <w:bidi w:val="0"/>
+        <w:jc w:val="start"/>
+        <w:rPr>
+          <w:rFonts w:ascii="Garamond" w:hAnsi="Garamond"/>
+          <w:b w:val="false"/>
+          <w:bCs w:val="false"/>
+        </w:rPr>
+      </w:pPr>
+      <w:r>
+        <w:rPr>
+          <w:rFonts w:ascii="Garamond" w:hAnsi="Garamond"/>
+          <w:b w:val="false"/>
+          <w:bCs w:val="false"/>
+        </w:rPr>
+      </w:r>
+    </w:p>
+    <w:p>
+      <w:pPr>
+        <w:pStyle w:val="BodyText"/>
+        <w:bidi w:val="0"/>
+        <w:jc w:val="start"/>
+        <w:rPr>
+          <w:rFonts w:ascii="Garamond" w:hAnsi="Garamond"/>
+          <w:b w:val="false"/>
+          <w:bCs w:val="false"/>
+        </w:rPr>
+      </w:pPr>
+      <w:r>
+        <w:rPr>
+          <w:rFonts w:ascii="Garamond" w:hAnsi="Garamond"/>
+          <w:b w:val="false"/>
+          <w:bCs w:val="false"/>
+        </w:rPr>
+      </w:r>
+    </w:p>
+    <w:p>
+      <w:pPr>
+        <w:pStyle w:val="BodyText"/>
+        <w:bidi w:val="0"/>
+        <w:jc w:val="start"/>
+        <w:rPr>
+          <w:rFonts w:ascii="Garamond" w:hAnsi="Garamond"/>
+          <w:b w:val="false"/>
+          <w:bCs w:val="false"/>
+        </w:rPr>
+      </w:pPr>
+      <w:r>
+        <w:rPr>
+          <w:rFonts w:ascii="Garamond" w:hAnsi="Garamond"/>
+          <w:b w:val="false"/>
+          <w:bCs w:val="false"/>
+        </w:rPr>
+      </w:r>
+    </w:p>
+    <w:p>
+      <w:pPr>
+        <w:pStyle w:val="BodyText"/>
+        <w:bidi w:val="0"/>
+        <w:jc w:val="start"/>
+        <w:rPr>
+          <w:rFonts w:ascii="Garamond" w:hAnsi="Garamond"/>
+          <w:b w:val="false"/>
+          <w:bCs w:val="false"/>
+        </w:rPr>
+      </w:pPr>
+      <w:r>
+        <w:rPr>
+          <w:rFonts w:ascii="Garamond" w:hAnsi="Garamond"/>
+          <w:b w:val="false"/>
+          <w:bCs w:val="false"/>
+        </w:rPr>
+      </w:r>
+    </w:p>
+    <w:p>
+      <w:pPr>
+        <w:pStyle w:val="BodyText"/>
+        <w:bidi w:val="0"/>
+        <w:jc w:val="start"/>
+        <w:rPr>
+          <w:rFonts w:ascii="Garamond" w:hAnsi="Garamond"/>
+          <w:b w:val="false"/>
+          <w:bCs w:val="false"/>
+        </w:rPr>
+      </w:pPr>
+      <w:r>
+        <w:rPr>
+          <w:rFonts w:ascii="Garamond" w:hAnsi="Garamond"/>
+          <w:b w:val="false"/>
+          <w:bCs w:val="false"/>
+        </w:rPr>
+      </w:r>
+    </w:p>
+    <w:p>
+      <w:pPr>
+        <w:pStyle w:val="BodyText"/>
+        <w:bidi w:val="0"/>
+        <w:jc w:val="start"/>
+        <w:rPr>
+          <w:rFonts w:ascii="Garamond" w:hAnsi="Garamond"/>
+          <w:b w:val="false"/>
+          <w:bCs w:val="false"/>
+        </w:rPr>
+      </w:pPr>
+      <w:r>
+        <w:rPr>
+          <w:rFonts w:ascii="Garamond" w:hAnsi="Garamond"/>
+          <w:b w:val="false"/>
+          <w:bCs w:val="false"/>
+        </w:rPr>
+      </w:r>
+    </w:p>
+    <w:p>
+      <w:pPr>
+        <w:pStyle w:val="BodyText"/>
+        <w:bidi w:val="0"/>
+        <w:jc w:val="start"/>
+        <w:rPr>
+          <w:rFonts w:ascii="Garamond" w:hAnsi="Garamond"/>
+          <w:b w:val="false"/>
+          <w:bCs w:val="false"/>
+        </w:rPr>
+      </w:pPr>
+      <w:r>
+        <w:rPr>
+          <w:rFonts w:ascii="Garamond" w:hAnsi="Garamond"/>
+          <w:b w:val="false"/>
+          <w:bCs w:val="false"/>
+        </w:rPr>
+        <w:t xml:space="preserve">I chose a graph structure because road networks naturally form graphs where intersections represent nodes and roads represent edges. The common structure allows efficient traversal and route discovery between connected intersections. </w:t>
       </w:r>
     </w:p>
     <w:p>
@@ -294,27 +468,7 @@
           <w:sz w:val="24"/>
           <w:szCs w:val="24"/>
         </w:rPr>
-        <w:t>Exten</w:t>
-      </w:r>
-      <w:r>
-        <w:rPr>
-          <w:rFonts w:ascii="Garamond" w:hAnsi="Garamond"/>
-          <w:b w:val="false"/>
-          <w:bCs w:val="false"/>
-          <w:sz w:val="24"/>
-          <w:szCs w:val="24"/>
-        </w:rPr>
-        <w:t>dible</w:t>
-      </w:r>
-      <w:r>
-        <w:rPr>
-          <w:rFonts w:ascii="Garamond" w:hAnsi="Garamond"/>
-          <w:b w:val="false"/>
-          <w:bCs w:val="false"/>
-          <w:sz w:val="24"/>
-          <w:szCs w:val="24"/>
-        </w:rPr>
-        <w:t xml:space="preserve">. Can easily add: </w:t>
+        <w:t xml:space="preserve">Extendible. Can easily add: </w:t>
       </w:r>
     </w:p>
     <w:p>
@@ -680,27 +834,7 @@
           <w:sz w:val="24"/>
           <w:szCs w:val="24"/>
         </w:rPr>
-        <w:t>Very large maps may require optimi</w:t>
-      </w:r>
-      <w:r>
-        <w:rPr>
-          <w:rFonts w:ascii="Garamond" w:hAnsi="Garamond"/>
-          <w:b w:val="false"/>
-          <w:bCs w:val="false"/>
-          <w:sz w:val="24"/>
-          <w:szCs w:val="24"/>
-        </w:rPr>
-        <w:t>s</w:t>
-      </w:r>
-      <w:r>
-        <w:rPr>
-          <w:rFonts w:ascii="Garamond" w:hAnsi="Garamond"/>
-          <w:b w:val="false"/>
-          <w:bCs w:val="false"/>
-          <w:sz w:val="24"/>
-          <w:szCs w:val="24"/>
-        </w:rPr>
-        <w:t>ation strategies.</w:t>
+        <w:t>Very large maps may require optimisation strategies.</w:t>
       </w:r>
     </w:p>
     <w:p>
@@ -787,27 +921,7 @@
           <w:sz w:val="24"/>
           <w:szCs w:val="24"/>
         </w:rPr>
-        <w:t xml:space="preserve">BFS is good as it explores nearest roads first </w:t>
-      </w:r>
-      <w:r>
-        <w:rPr>
-          <w:rFonts w:ascii="Garamond" w:hAnsi="Garamond"/>
-          <w:b w:val="false"/>
-          <w:bCs w:val="false"/>
-          <w:sz w:val="24"/>
-          <w:szCs w:val="24"/>
-        </w:rPr>
-        <w:t xml:space="preserve">and </w:t>
-      </w:r>
-      <w:r>
-        <w:rPr>
-          <w:rFonts w:ascii="Garamond" w:hAnsi="Garamond"/>
-          <w:b w:val="false"/>
-          <w:bCs w:val="false"/>
-          <w:sz w:val="24"/>
-          <w:szCs w:val="24"/>
-        </w:rPr>
-        <w:t>guarantees the shortest path in terms of number of roads travelled when all roads have equal weight.</w:t>
+        <w:t>BFS is good as it explores nearest roads first and guarantees the shortest path in terms of number of roads travelled when all roads have equal weight.</w:t>
       </w:r>
     </w:p>
     <w:p>
@@ -1011,47 +1125,7 @@
           <w:sz w:val="24"/>
           <w:szCs w:val="24"/>
         </w:rPr>
-        <w:t xml:space="preserve">BFS is no longer sufficient. </w:t>
-      </w:r>
-      <w:r>
-        <w:rPr>
-          <w:rFonts w:ascii="Garamond" w:hAnsi="Garamond"/>
-          <w:b w:val="false"/>
-          <w:bCs w:val="false"/>
-          <w:sz w:val="24"/>
-          <w:szCs w:val="24"/>
-        </w:rPr>
-        <w:t>We</w:t>
-      </w:r>
-      <w:r>
-        <w:rPr>
-          <w:rFonts w:ascii="Garamond" w:hAnsi="Garamond"/>
-          <w:b w:val="false"/>
-          <w:bCs w:val="false"/>
-          <w:sz w:val="24"/>
-          <w:szCs w:val="24"/>
-        </w:rPr>
-        <w:t xml:space="preserve"> now need Dijkstra's Algorith</w:t>
-      </w:r>
-      <w:r>
-        <w:rPr>
-          <w:rFonts w:ascii="Garamond" w:hAnsi="Garamond"/>
-          <w:b w:val="false"/>
-          <w:bCs w:val="false"/>
-          <w:sz w:val="24"/>
-          <w:szCs w:val="24"/>
-        </w:rPr>
-        <w:t>m b</w:t>
-      </w:r>
-      <w:r>
-        <w:rPr>
-          <w:rFonts w:ascii="Garamond" w:hAnsi="Garamond"/>
-          <w:b w:val="false"/>
-          <w:bCs w:val="false"/>
-          <w:sz w:val="24"/>
-          <w:szCs w:val="24"/>
-        </w:rPr>
-        <w:t>ecause:</w:t>
+        <w:t>BFS is no longer sufficient. We now need Dijkstra's Algorithm because:</w:t>
       </w:r>
       <w:r>
         <w:rPr>
@@ -1062,88 +1136,17 @@
           <w:sz w:val="24"/>
           <w:szCs w:val="24"/>
         </w:rPr>
-        <w:t xml:space="preserve"> </w:t>
-      </w:r>
-      <w:r>
-        <w:rPr>
-          <w:rStyle w:val="SourceText"/>
-          <w:rFonts w:ascii="Garamond" w:hAnsi="Garamond"/>
-          <w:b w:val="false"/>
-          <w:bCs w:val="false"/>
-          <w:sz w:val="24"/>
-          <w:szCs w:val="24"/>
-        </w:rPr>
-        <w:t xml:space="preserve">A-&gt;B </w:t>
-      </w:r>
-      <w:r>
-        <w:rPr>
-          <w:rFonts w:ascii="Garamond" w:hAnsi="Garamond"/>
-          <w:b w:val="false"/>
-          <w:bCs w:val="false"/>
-          <w:sz w:val="24"/>
-          <w:szCs w:val="24"/>
-        </w:rPr>
-        <w:t xml:space="preserve">might be fewer roads but </w:t>
-      </w:r>
-      <w:r>
-        <w:rPr>
-          <w:rFonts w:ascii="Garamond" w:hAnsi="Garamond"/>
-          <w:b w:val="false"/>
-          <w:bCs w:val="false"/>
-          <w:sz w:val="24"/>
-          <w:szCs w:val="24"/>
-        </w:rPr>
-        <w:t>it is a l</w:t>
-      </w:r>
-      <w:r>
-        <w:rPr>
-          <w:rFonts w:ascii="Garamond" w:hAnsi="Garamond"/>
-          <w:b w:val="false"/>
-          <w:bCs w:val="false"/>
-          <w:sz w:val="24"/>
-          <w:szCs w:val="24"/>
-        </w:rPr>
-        <w:t xml:space="preserve">onger distance </w:t>
-      </w:r>
-      <w:r>
-        <w:rPr>
-          <w:rFonts w:ascii="Garamond" w:hAnsi="Garamond"/>
-          <w:b w:val="false"/>
-          <w:bCs w:val="false"/>
-          <w:sz w:val="24"/>
-          <w:szCs w:val="24"/>
-        </w:rPr>
-        <w:t>so BFS would no longer be suitable</w:t>
-      </w:r>
-      <w:r>
-        <w:rPr>
-          <w:rFonts w:ascii="Garamond" w:hAnsi="Garamond"/>
-          <w:b w:val="false"/>
-          <w:bCs w:val="false"/>
-          <w:sz w:val="24"/>
-          <w:szCs w:val="24"/>
-        </w:rPr>
-        <w:t xml:space="preserve">. Dijkstra finds </w:t>
-      </w:r>
-      <w:r>
-        <w:rPr>
-          <w:rFonts w:ascii="Garamond" w:hAnsi="Garamond"/>
-          <w:b w:val="false"/>
-          <w:bCs w:val="false"/>
-          <w:sz w:val="24"/>
-          <w:szCs w:val="24"/>
-        </w:rPr>
-        <w:t xml:space="preserve">the </w:t>
-      </w:r>
-      <w:r>
-        <w:rPr>
-          <w:rFonts w:ascii="Garamond" w:hAnsi="Garamond"/>
-          <w:b w:val="false"/>
-          <w:bCs w:val="false"/>
-          <w:sz w:val="24"/>
-          <w:szCs w:val="24"/>
-        </w:rPr>
-        <w:t>shortest travel distance.</w:t>
+        <w:t xml:space="preserve"> A-&gt;B </w:t>
+      </w:r>
+      <w:r>
+        <w:rPr>
+          <w:rFonts w:ascii="Garamond" w:hAnsi="Garamond"/>
+          <w:b w:val="false"/>
+          <w:bCs w:val="false"/>
+          <w:sz w:val="24"/>
+          <w:szCs w:val="24"/>
+        </w:rPr>
+        <w:t>might be fewer roads but it is a longer distance so BFS would no longer be suitable. Dijkstra finds the shortest travel distance.</w:t>
       </w:r>
     </w:p>
     <w:p>
@@ -1178,6 +1181,7 @@
       <w:pgNumType w:fmt="decimal"/>
       <w:formProt w:val="false"/>
       <w:textDirection w:val="lrTb"/>
+      <w:docGrid w:type="default" w:linePitch="100" w:charSpace="0"/>
     </w:sectPr>
   </w:body>
 </w:document>
@@ -1189,7 +1193,6 @@
     <w:lvl w:ilvl="0">
       <w:start w:val="1"/>
       <w:numFmt w:val="none"/>
-      <w:pStyle w:val="Heading1"/>
       <w:suff w:val="nothing"/>
       <w:lvlText w:val=""/>
       <w:lvlJc w:val="start"/>
@@ -1203,7 +1206,6 @@
     <w:lvl w:ilvl="1">
       <w:start w:val="1"/>
       <w:numFmt w:val="none"/>
-      <w:pStyle w:val="Heading2"/>
       <w:suff w:val="nothing"/>
       <w:lvlText w:val=""/>
       <w:lvlJc w:val="start"/>
@@ -1217,7 +1219,6 @@
     <w:lvl w:ilvl="2">
       <w:start w:val="1"/>
       <w:numFmt w:val="none"/>
-      <w:pStyle w:val="Heading3"/>
       <w:suff w:val="nothing"/>
       <w:lvlText w:val=""/>
       <w:lvlJc w:val="start"/>
@@ -1607,7 +1608,6 @@
     </w:rPrDefault>
     <w:pPrDefault>
       <w:pPr>
-        <w:widowControl/>
         <w:suppressAutoHyphens w:val="true"/>
       </w:pPr>
     </w:pPrDefault>
@@ -1617,7 +1617,10 @@
     <w:qFormat/>
     <w:pPr>
       <w:widowControl/>
+      <w:suppressAutoHyphens w:val="true"/>
       <w:bidi w:val="0"/>
+      <w:spacing w:before="0" w:after="0"/>
+      <w:jc w:val="start"/>
     </w:pPr>
     <w:rPr>
       <w:rFonts w:ascii="Liberation Serif" w:hAnsi="Liberation Serif" w:eastAsia="NSimSun" w:cs="Arial"/>
@@ -1679,8 +1682,8 @@
       <w:szCs w:val="28"/>
     </w:rPr>
   </w:style>
-  <w:style w:type="character" w:styleId="Bullets">
-    <w:name w:val="Bullets"/>
+  <w:style w:type="character" w:styleId="Bulletsuser">
+    <w:name w:val="Bullets (user)"/>
     <w:qFormat/>
     <w:rPr>
       <w:rFonts w:ascii="OpenSymbol" w:hAnsi="OpenSymbol" w:eastAsia="OpenSymbol" w:cs="OpenSymbol"/>
@@ -1810,8 +1813,8 @@
       <w:szCs w:val="12"/>
     </w:rPr>
   </w:style>
-  <w:style w:type="paragraph" w:styleId="BlockQuotation">
-    <w:name w:val="Block Quotation"/>
+  <w:style w:type="paragraph" w:styleId="BlockQuotationuser">
+    <w:name w:val="Block Quotation (user)"/>
     <w:basedOn w:val="Normal"/>
     <w:qFormat/>
     <w:pPr>

</xml_diff>